<commit_message>
250628/GDD 작성중 + 맵 개발
</commit_message>
<xml_diff>
--- a/Assets/0. Project Info/Side Tps Project GDD.docx
+++ b/Assets/0. Project Info/Side Tps Project GDD.docx
@@ -98,6 +98,12 @@
         </w:rPr>
         <w:t xml:space="preserve"> </w:t>
       </w:r>
+      <w:r>
+        <w:rPr>
+          <w:rFonts w:hint="eastAsia"/>
+        </w:rPr>
+        <w:t>Low Poly Battleground</w:t>
+      </w:r>
     </w:p>
     <w:p>
       <w:pPr>
@@ -116,6 +122,26 @@
       <w:r>
         <w:t>:</w:t>
       </w:r>
+      <w:r>
+        <w:rPr>
+          <w:rFonts w:hint="eastAsia"/>
+        </w:rPr>
+        <w:t xml:space="preserve"> </w:t>
+      </w:r>
+      <w:proofErr w:type="spellStart"/>
+      <w:r>
+        <w:rPr>
+          <w:rFonts w:hint="eastAsia"/>
+        </w:rPr>
+        <w:t>배틀로얄</w:t>
+      </w:r>
+      <w:proofErr w:type="spellEnd"/>
+      <w:r>
+        <w:rPr>
+          <w:rFonts w:hint="eastAsia"/>
+        </w:rPr>
+        <w:t>, 액션, TPS, 서바이벌</w:t>
+      </w:r>
     </w:p>
     <w:p>
       <w:pPr>
@@ -132,7 +158,13 @@
         <w:t>플랫폼</w:t>
       </w:r>
       <w:r>
-        <w:t>: (예: PC, 모바일 등)</w:t>
+        <w:t xml:space="preserve">: </w:t>
+      </w:r>
+      <w:r>
+        <w:rPr>
+          <w:rFonts w:hint="eastAsia"/>
+        </w:rPr>
+        <w:t>PC</w:t>
       </w:r>
     </w:p>
     <w:p>
@@ -159,8 +191,16 @@
       </w:r>
       <w:proofErr w:type="spellEnd"/>
       <w:r>
-        <w:t>: (예: 10대 후반~30대 초반, 슈팅 장르 팬 등)</w:t>
-      </w:r>
+        <w:t xml:space="preserve">: </w:t>
+      </w:r>
+      <w:proofErr w:type="spellStart"/>
+      <w:r>
+        <w:rPr>
+          <w:rFonts w:hint="eastAsia"/>
+        </w:rPr>
+        <w:t>배그</w:t>
+      </w:r>
+      <w:proofErr w:type="spellEnd"/>
     </w:p>
     <w:p>
       <w:pPr>
@@ -177,7 +217,27 @@
         <w:t>요약 설명</w:t>
       </w:r>
       <w:r>
-        <w:t>: (한 문장으로 핵심 설명)</w:t>
+        <w:t xml:space="preserve">: </w:t>
+      </w:r>
+      <w:r>
+        <w:rPr>
+          <w:rFonts w:hint="eastAsia"/>
+        </w:rPr>
+        <w:t xml:space="preserve">로우 </w:t>
+      </w:r>
+      <w:proofErr w:type="spellStart"/>
+      <w:r>
+        <w:rPr>
+          <w:rFonts w:hint="eastAsia"/>
+        </w:rPr>
+        <w:t>폴리곤으로</w:t>
+      </w:r>
+      <w:proofErr w:type="spellEnd"/>
+      <w:r>
+        <w:rPr>
+          <w:rFonts w:hint="eastAsia"/>
+        </w:rPr>
+        <w:t xml:space="preserve"> 구현한 배틀 그라운드</w:t>
       </w:r>
     </w:p>
     <w:p>
@@ -220,16 +280,17 @@
     <w:p>
       <w:pPr>
         <w:numPr>
-          <w:ilvl w:val="0"/>
+          <w:ilvl w:val="1"/>
           <w:numId w:val="2"/>
         </w:numPr>
       </w:pPr>
       <w:r>
         <w:rPr>
-          <w:b/>
-          <w:bCs/>
-        </w:rPr>
-        <w:t>기획 방향성</w:t>
+          <w:rFonts w:hint="eastAsia"/>
+          <w:b/>
+          <w:bCs/>
+        </w:rPr>
+        <w:t>다양한 기능 구현</w:t>
       </w:r>
     </w:p>
     <w:p>
@@ -244,6 +305,21 @@
           <w:b/>
           <w:bCs/>
         </w:rPr>
+        <w:t>기획 방향성</w:t>
+      </w:r>
+    </w:p>
+    <w:p>
+      <w:pPr>
+        <w:numPr>
+          <w:ilvl w:val="0"/>
+          <w:numId w:val="2"/>
+        </w:numPr>
+      </w:pPr>
+      <w:r>
+        <w:rPr>
+          <w:b/>
+          <w:bCs/>
+        </w:rPr>
         <w:t>벤치마킹 게임</w:t>
       </w:r>
       <w:r>
@@ -295,23 +371,119 @@
         </w:numPr>
       </w:pPr>
       <w:r>
-        <w:t xml:space="preserve">기본 공격 방식 (예: </w:t>
+        <w:t>기본 공격 방식</w:t>
+      </w:r>
+    </w:p>
+    <w:p>
+      <w:pPr>
+        <w:numPr>
+          <w:ilvl w:val="1"/>
+          <w:numId w:val="3"/>
+        </w:numPr>
+      </w:pPr>
+      <w:r>
+        <w:rPr>
+          <w:rFonts w:hint="eastAsia"/>
+        </w:rPr>
+        <w:t>이동: WASD</w:t>
+      </w:r>
+    </w:p>
+    <w:p>
+      <w:pPr>
+        <w:numPr>
+          <w:ilvl w:val="1"/>
+          <w:numId w:val="3"/>
+        </w:numPr>
+      </w:pPr>
+      <w:r>
+        <w:rPr>
+          <w:rFonts w:hint="eastAsia"/>
+        </w:rPr>
+        <w:t>공격: left Click</w:t>
+      </w:r>
+    </w:p>
+    <w:p>
+      <w:pPr>
+        <w:numPr>
+          <w:ilvl w:val="1"/>
+          <w:numId w:val="3"/>
+        </w:numPr>
+      </w:pPr>
+      <w:r>
+        <w:rPr>
+          <w:rFonts w:hint="eastAsia"/>
+        </w:rPr>
+        <w:t>줌 인: right Click</w:t>
+      </w:r>
+    </w:p>
+    <w:p>
+      <w:pPr>
+        <w:numPr>
+          <w:ilvl w:val="1"/>
+          <w:numId w:val="3"/>
+        </w:numPr>
+      </w:pPr>
+      <w:r>
+        <w:rPr>
+          <w:rFonts w:hint="eastAsia"/>
+        </w:rPr>
+        <w:t>아이템 획득: F</w:t>
+      </w:r>
+    </w:p>
+    <w:p>
+      <w:pPr>
+        <w:numPr>
+          <w:ilvl w:val="1"/>
+          <w:numId w:val="3"/>
+        </w:numPr>
+      </w:pPr>
+      <w:r>
+        <w:rPr>
+          <w:rFonts w:hint="eastAsia"/>
+        </w:rPr>
+        <w:t>인벤토리: Tab</w:t>
+      </w:r>
+    </w:p>
+    <w:p>
+      <w:pPr>
+        <w:numPr>
+          <w:ilvl w:val="1"/>
+          <w:numId w:val="3"/>
+        </w:numPr>
+      </w:pPr>
+      <w:r>
+        <w:rPr>
+          <w:rFonts w:hint="eastAsia"/>
+        </w:rPr>
+        <w:t xml:space="preserve">아이템 버리기: </w:t>
       </w:r>
       <w:proofErr w:type="spellStart"/>
       <w:r>
+        <w:rPr>
+          <w:rFonts w:hint="eastAsia"/>
+        </w:rPr>
         <w:t>좌클릭</w:t>
       </w:r>
       <w:proofErr w:type="spellEnd"/>
       <w:r>
-        <w:t xml:space="preserve"> 발사, </w:t>
-      </w:r>
-      <w:proofErr w:type="spellStart"/>
-      <w:r>
-        <w:t>우클릭</w:t>
-      </w:r>
-      <w:proofErr w:type="spellEnd"/>
-      <w:r>
-        <w:t xml:space="preserve"> 조준 등)</w:t>
+        <w:rPr>
+          <w:rFonts w:hint="eastAsia"/>
+        </w:rPr>
+        <w:t xml:space="preserve"> 드래그</w:t>
+      </w:r>
+    </w:p>
+    <w:p>
+      <w:pPr>
+        <w:numPr>
+          <w:ilvl w:val="1"/>
+          <w:numId w:val="3"/>
+        </w:numPr>
+      </w:pPr>
+      <w:r>
+        <w:rPr>
+          <w:rFonts w:hint="eastAsia"/>
+        </w:rPr>
+        <w:t xml:space="preserve">아이템 </w:t>
       </w:r>
     </w:p>
     <w:p>
@@ -322,6 +494,7 @@
         </w:numPr>
       </w:pPr>
       <w:r>
+        <w:lastRenderedPageBreak/>
         <w:t>무기 종류 및 특성 요약</w:t>
       </w:r>
     </w:p>
@@ -430,7 +603,6 @@
     </w:p>
     <w:p>
       <w:r>
-        <w:lastRenderedPageBreak/>
         <w:pict w14:anchorId="78EB04A9">
           <v:rect id="_x0000_i1028" style="width:0;height:1.5pt" o:hralign="center" o:hrstd="t" o:hr="t" fillcolor="#a0a0a0" stroked="f"/>
         </w:pict>
@@ -686,6 +858,7 @@
           <w:b/>
           <w:bCs/>
         </w:rPr>
+        <w:lastRenderedPageBreak/>
         <w:t>6. UI/UX 설계</w:t>
       </w:r>
     </w:p>
@@ -811,7 +984,6 @@
         </w:numPr>
       </w:pPr>
       <w:r>
-        <w:lastRenderedPageBreak/>
         <w:t>스킨, 코스튬, 기타 수집 요소</w:t>
       </w:r>
     </w:p>
@@ -1214,6 +1386,7 @@
         </w:numPr>
       </w:pPr>
       <w:r>
+        <w:lastRenderedPageBreak/>
         <w:t>유튜브 링크 등도 포함 가능</w:t>
       </w:r>
     </w:p>
@@ -2293,7 +2466,7 @@
         <w:sz w:val="20"/>
       </w:rPr>
     </w:lvl>
-    <w:lvl w:ilvl="1" w:tentative="1">
+    <w:lvl w:ilvl="1">
       <w:start w:val="1"/>
       <w:numFmt w:val="bullet"/>
       <w:lvlText w:val="o"/>
@@ -2591,7 +2764,7 @@
         <w:sz w:val="20"/>
       </w:rPr>
     </w:lvl>
-    <w:lvl w:ilvl="1" w:tentative="1">
+    <w:lvl w:ilvl="1">
       <w:start w:val="1"/>
       <w:numFmt w:val="bullet"/>
       <w:lvlText w:val="o"/>
@@ -3816,7 +3989,6 @@
   <w:style w:type="character" w:default="1" w:styleId="a0">
     <w:name w:val="Default Paragraph Font"/>
     <w:uiPriority w:val="1"/>
-    <w:semiHidden/>
     <w:unhideWhenUsed/>
   </w:style>
   <w:style w:type="table" w:default="1" w:styleId="a1">
@@ -4125,6 +4297,29 @@
       <w:spacing w:val="5"/>
     </w:rPr>
   </w:style>
+  <w:style w:type="character" w:styleId="aa">
+    <w:name w:val="Hyperlink"/>
+    <w:basedOn w:val="a0"/>
+    <w:uiPriority w:val="99"/>
+    <w:unhideWhenUsed/>
+    <w:rsid w:val="00DA47A5"/>
+    <w:rPr>
+      <w:color w:val="467886" w:themeColor="hyperlink"/>
+      <w:u w:val="single"/>
+    </w:rPr>
+  </w:style>
+  <w:style w:type="character" w:styleId="ab">
+    <w:name w:val="Unresolved Mention"/>
+    <w:basedOn w:val="a0"/>
+    <w:uiPriority w:val="99"/>
+    <w:semiHidden/>
+    <w:unhideWhenUsed/>
+    <w:rsid w:val="00DA47A5"/>
+    <w:rPr>
+      <w:color w:val="605E5C"/>
+      <w:shd w:val="clear" w:color="auto" w:fill="E1DFDD"/>
+    </w:rPr>
+  </w:style>
 </w:styles>
 </file>
 

</xml_diff>